<commit_message>
Incorpora melhorias metodologicas e figuras validadas ao artigo ate 5C
</commit_message>
<xml_diff>
--- a/Artigo_CO2_Modelagem_Matematica_IA.docx
+++ b/Artigo_CO2_Modelagem_Matematica_IA.docx
@@ -188,6 +188,12 @@
     <w:p>
       <w:pPr/>
       <w:r>
+        <w:t>A seleção da unidade, a preparação dos dados, a construção das representações, o ajuste dos modelos e a interpretação dos resultados compõem o encadeamento da pesquisa. Essa organização aproxima-se do processo de descoberta de conhecimento descrito por Fayyad, Piatetsky-Shapiro e Smyth (1996), no qual o ajuste dos modelos integra um processo mais amplo de preparação e avaliação. As decisões exploratórias permanecem identificadas como retrospectivas.</w:t>
+      </w:r>
+    </w:p>
+    <w:p>
+      <w:pPr/>
+      <w:r>
         <w:t>A seleção considerou unidades a carvão com registros de CO₂ associados à própria unidade, método CEM e cobertura de monitoramento em 2025. Foram exigidas completude dos registros, participação de medição e operação ao longo do ano. Os filtros e suas contagens constam no Apêndice A. Entre as unidades elegíveis, a comparação da variabilidade operacional levou à Iatan Unit 2, Facility ID 6065, caracterizada na Tabela 1. Como a escolha utilizou informações de todo o ano de 2025, trata-se de seleção retrospectiva de um caso informativo, sem amostragem probabilística.</w:t>
       </w:r>
     </w:p>
@@ -849,7 +855,7 @@
     <w:p>
       <w:pPr/>
       <w:r>
-        <w:t>A comparação utilizou três conjuntos de entrada: A contém apenas a carga contemporânea; B acrescenta trajetória e memória operacional, reunindo os sete atributos da Tabela 2; C amplia essa representação para 24 atributos, descritos no Apêndice A. Esses conjuntos permitem examinar o valor preditivo das informações adicionais em relação à carga atual.</w:t>
+        <w:t>A comparação utilizou três conjuntos de entrada: A contém apenas a carga contemporânea; B acrescenta trajetória e memória operacional, reunindo os sete atributos da Tabela 2; C amplia essa representação para 24 atributos, descritos no Apêndice A. Esses conjuntos permitem examinar o valor preditivo das informações adicionais em relação à carga atual. O conhecimento da operação orientou a escolha e a construção dos atributos. Os estimadores foram ajustados aos dados, sem imposição de equações físicas na função de perda.</w:t>
       </w:r>
     </w:p>
     <w:p>
@@ -5268,13 +5274,13 @@
     <w:p>
       <w:pPr/>
       <w:r>
-        <w:t>A análise complementar de calendário encontrou, para a redução média do erro absoluto de B frente a A nas rampas, 5,51 short tons por registro, com limites de reamostragem positivos nos três comprimentos de bloco. Na comparação global, a diferença foi −1,02, e todos os limites incluíram zero. Esses resultados caracterizam a sensibilidade das previsões já ajustadas; não transformam o teste reutilizado em validação confirmatória. A ablação e suas limitações constam no Apêndice D.</w:t>
+        <w:t>A análise complementar de calendário encontrou, para a redução média do erro absoluto de B frente a A nas rampas, 5,51 short tons por registro, com limites de reamostragem positivos nos três comprimentos de bloco. Na comparação global, a diferença foi −1,02, e todos os limites incluíram zero. Esses resultados caracterizam a sensibilidade das previsões já ajustadas; não transformam o teste reutilizado em validação confirmatória. A Figura D1 apresenta essa sensibilidade lado a lado nos contextos global e de rampas. A ablação e suas limitações constam no Apêndice D.</w:t>
       </w:r>
     </w:p>
     <w:p>
       <w:pPr/>
       <w:r>
-        <w:t>Na comparação complementar com cinco sementes, o XGBoost apresentou menor MAE de teste que a MLP nos cenários A e B em todas as sementes. As médias e os desvios padrão entre sementes foram 20,45 ± 0,02 e 21,22 ± 0,62 para XGBoost A e B; para MLP A e B, 57,28 ± 1,25 e 56,38 ± 1,82. A trajetória reduziu o MAE em três das cinco sementes da MLP e em uma das cinco do XGBoost. Esses resultados descrevem o novo protocolo sem reajuste com outubro e não substituem as comparações anteriores. Na validação, a ordenação entre famílias foi inversa, com menor MAE da MLP; os valores completos estão na Tabela D4.</w:t>
+        <w:t>Na comparação complementar com cinco sementes, o XGBoost apresentou menor MAE de teste que a MLP nos cenários A e B em todas as sementes. As médias e os desvios padrão entre sementes foram 20,45 ± 0,02 e 21,22 ± 0,62 para XGBoost A e B; para MLP A e B, 57,28 ± 1,25 e 56,38 ± 1,82. A trajetória reduziu o MAE em três das cinco sementes da MLP e em uma das cinco do XGBoost. Esses resultados descrevem o novo protocolo sem reajuste com outubro e não substituem as comparações anteriores. Na validação, a ordenação entre famílias foi inversa, com menor MAE da MLP; a Figura D2 torna visível essa inversão nas mesmas sementes, e os valores completos estão na Tabela D4.</w:t>
       </w:r>
     </w:p>
     <w:p>
@@ -5284,6 +5290,12 @@
       </w:pPr>
       <w:r>
         <w:t>5 Discussão</w:t>
+      </w:r>
+    </w:p>
+    <w:p>
+      <w:pPr/>
+      <w:r>
+        <w:t>Os complementos examinam dimensões distintas da comparação. O 03A.05A avalia a retirada de atributos sob configuração fixada; o 03A.05B examina a sensibilidade temporal das perdas dos modelos preservados; e o 03A.05C descreve a variabilidade do treinamento entre sementes. Seus resultados delimitam a interpretação das comparações originais, sem constituir avaliações independentes em novos períodos.</w:t>
       </w:r>
     </w:p>
     <w:p>
@@ -5362,6 +5374,12 @@
       <w:pPr/>
       <w:r>
         <w:t>Os arquivos anuais preservados e os dados volumosos de reprodução integram um pacote complementar no Drive, com acesso restrito aos colaboradores autorizados. Uma nova consulta à EPA permite obter dados públicos, mas não garante arquivos idênticos aos preservados. Além da reprodução local das duas etapas finais em 24 de outubro, foram inspecionadas as novas execuções completas dos oito notebooks principais recebidas em 29 de outubro de 2026, com resultados salvos e sem erros de execução registrados. A ablação, a reamostragem em calendário e a comparação de cinco sementes foram executadas no Colab. A conferência independente dos pacotes finais reuniu 376 verificações, incluindo identidade dos insumos, recálculo das métricas e recarga dos 20 modelos do 03A.05C. As previsões dos XGBoosts coincidiram exatamente; nas MLPs, a maior diferença de inferência entre plataformas foi 0,0001221 short ton, inferior à tolerância de 0,001. As métricas publicadas foram calculadas das previsões originais do Colab. Essa inspeção não equivale a uma reprodução local independente de todos os ajustes. O registro bibliográfico reúne DOI ou URL oficial e a aplicação de cada fonte; as cópias de artigos permanecem na biblioteca privada quando a licença de redistribuição pública não está confirmada. Os links históricos do Apêndice B identificam a versão de 24 de outubro. A atualização consolidada do artigo, notebooks executados, tabelas e registros de conferência está disponível na pasta outputs/auditoria_consolidada_2026-10-29 do repositório, indicada também no README. Os dados volumosos e os PDFs privados das referências permanecem no Drive do projeto.</w:t>
+      </w:r>
+    </w:p>
+    <w:p>
+      <w:pPr/>
+      <w:r>
+        <w:t>Na revisão documental de 30 de outubro de 2026, 38 verificações adicionais conferiram a reconstrução dos atributos, a ausência de influência de observações futuras sobre os atributos passados e a fidelidade das figuras aos resultados preservados. Essas verificações e os arquivos usados nas figuras estão registrados em outputs/revisao_material_2026-10-30. Não houve novo treinamento nessa revisão. O mapa de experimentos concluídos relaciona as perguntas de cada etapa aos respectivos protocolos e arquivos de evidência.</w:t>
       </w:r>
     </w:p>
     <w:p>
@@ -5458,6 +5476,14 @@
       </w:pPr>
       <w:r>
         <w:t>FAYAZ, S. J. et al. A Multi-Plant Machine Learning Framework for Emission Prediction, Forecasting, and Control in Cement Manufacturing. arXiv, 2026. Preprint arXiv:2604.19903v1, submetido em 21 abr. 2026. DOI: https://doi.org/10.48550/arXiv.2604.19903. Disponível em: https://arxiv.org/abs/2604.19903. Acesso em: 29 out. 2026.</w:t>
+      </w:r>
+    </w:p>
+    <w:p>
+      <w:pPr>
+        <w:pStyle w:val="ArticleReference"/>
+      </w:pPr>
+      <w:r>
+        <w:t>FAYYAD, U.; PIATETSKY-SHAPIRO, G.; SMYTH, P. From Data Mining to Knowledge Discovery in Databases. AI Magazine, [s. l.], v. 17, n. 3, p. 37-54, 1996. DOI: https://doi.org/10.1609/aimag.v17i3.1230. Disponível em: https://ojs.aaai.org/aimagazine/index.php/aimagazine/article/view/1230. Acesso em: 30 out. 2026.</w:t>
       </w:r>
     </w:p>
     <w:p>
@@ -20332,6 +20358,66 @@
     <w:p>
       <w:pPr>
         <w:pStyle w:val="Caption"/>
+        <w:keepNext/>
+      </w:pPr>
+      <w:r>
+        <w:t>Figura D1 Sensibilidade da diferença de MAE global e nas rampas ao comprimento dos blocos</w:t>
+      </w:r>
+    </w:p>
+    <w:p>
+      <w:pPr>
+        <w:keepNext/>
+        <w:spacing w:before="0" w:after="80"/>
+        <w:ind w:firstLine="0"/>
+        <w:jc w:val="center"/>
+      </w:pPr>
+      <w:r>
+        <w:drawing>
+          <wp:inline xmlns:a="http://schemas.openxmlformats.org/drawingml/2006/main" xmlns:pic="http://schemas.openxmlformats.org/drawingml/2006/picture">
+            <wp:extent cx="6108192" cy="2431965"/>
+            <wp:docPr id="2" name="Picture 2" descr="Dois painéis com a diferença de MAE A menos B: no conjunto global os três limites de reamostragem incluem zero; nas rampas os três permanecem positivos. Comprimentos de bloco de um, três e sete dias."/>
+            <wp:cNvGraphicFramePr>
+              <a:graphicFrameLocks noChangeAspect="1"/>
+            </wp:cNvGraphicFramePr>
+            <a:graphic>
+              <a:graphicData uri="http://schemas.openxmlformats.org/drawingml/2006/picture">
+                <pic:pic>
+                  <pic:nvPicPr>
+                    <pic:cNvPr id="0" name="03A05B_sensibilidade_blocos_global_rampas.png"/>
+                    <pic:cNvPicPr/>
+                  </pic:nvPicPr>
+                  <pic:blipFill>
+                    <a:blip r:embed="rId71"/>
+                    <a:stretch>
+                      <a:fillRect/>
+                    </a:stretch>
+                  </pic:blipFill>
+                  <pic:spPr>
+                    <a:xfrm>
+                      <a:off x="0" y="0"/>
+                      <a:ext cx="6108192" cy="2431965"/>
+                    </a:xfrm>
+                    <a:prstGeom prst="rect"/>
+                  </pic:spPr>
+                </pic:pic>
+              </a:graphicData>
+            </a:graphic>
+          </wp:inline>
+        </w:drawing>
+      </w:r>
+    </w:p>
+    <w:p>
+      <w:pPr>
+        <w:pStyle w:val="ArticleNote"/>
+        <w:keepLines/>
+      </w:pPr>
+      <w:r>
+        <w:t>Fonte: resultados preservados do complemento 03A.05B. Pontos representam a diferença média de erro absoluto A − B, e barras, os percentis 2,5 e 97,5 da reamostragem por blocos de 1, 3 e 7 dias. Diferenças positivas favorecem B. Os limites são exploratórios, condicionais aos modelos salvos, sem cobertura nominal demonstrada e sem interpretação como intervalos de previsão.</w:t>
+      </w:r>
+    </w:p>
+    <w:p>
+      <w:pPr>
+        <w:pStyle w:val="Caption"/>
       </w:pPr>
       <w:r>
         <w:t>Tabela D3 Sensibilidade das reduções de B contra B completo</w:t>
@@ -22322,6 +22408,66 @@
     <w:p>
       <w:r>
         <w:t>A diferença MAE MLP − XGBoost foi positiva em todos os dez pares de mesma semente e cenário. Na validação, a MLP apresentou menor MAE em todos esses pares, mostrando inversão da ordenação entre outubro e novembro–dezembro. Nas médias de teste, B reduz o MAE da MLP em 1,57% e eleva o do XGBoost em 3,77%; os sinais por semente variam. As melhores épocas da MLP variam de 1 a 24 em A e de 19 a 30 em B; em A, duas sementes restauram a primeira época. O número selecionado de árvores varia de 356 a 498 em A e de 560 a 1.080 em B. Esses registros mostram a influência da validação na complexidade selecionada, sem autorizar nova escolha pelo teste.</w:t>
+      </w:r>
+    </w:p>
+    <w:p>
+      <w:pPr>
+        <w:pStyle w:val="Caption"/>
+        <w:keepNext/>
+      </w:pPr>
+      <w:r>
+        <w:t>Figura D2 MAE de validação e teste por família cenário e semente</w:t>
+      </w:r>
+    </w:p>
+    <w:p>
+      <w:pPr>
+        <w:keepNext/>
+        <w:spacing w:before="0" w:after="80"/>
+        <w:ind w:firstLine="0"/>
+        <w:jc w:val="center"/>
+      </w:pPr>
+      <w:r>
+        <w:drawing>
+          <wp:inline xmlns:a="http://schemas.openxmlformats.org/drawingml/2006/main" xmlns:pic="http://schemas.openxmlformats.org/drawingml/2006/picture">
+            <wp:extent cx="6108192" cy="2685498"/>
+            <wp:docPr id="3" name="Picture 3" descr="Painéis de validação e teste na mesma escala de MAE. MLP apresenta menor erro na validação de outubro, e XGBoost no teste de novembro e dezembro. Cada cenário mostra cinco sementes e a média, com linhas ligando A e B de mesma semente."/>
+            <wp:cNvGraphicFramePr>
+              <a:graphicFrameLocks noChangeAspect="1"/>
+            </wp:cNvGraphicFramePr>
+            <a:graphic>
+              <a:graphicData uri="http://schemas.openxmlformats.org/drawingml/2006/picture">
+                <pic:pic>
+                  <pic:nvPicPr>
+                    <pic:cNvPr id="0" name="03A05C_validacao_teste_sementes.png"/>
+                    <pic:cNvPicPr/>
+                  </pic:nvPicPr>
+                  <pic:blipFill>
+                    <a:blip r:embed="rId72"/>
+                    <a:stretch>
+                      <a:fillRect/>
+                    </a:stretch>
+                  </pic:blipFill>
+                  <pic:spPr>
+                    <a:xfrm>
+                      <a:off x="0" y="0"/>
+                      <a:ext cx="6108192" cy="2685498"/>
+                    </a:xfrm>
+                    <a:prstGeom prst="rect"/>
+                  </pic:spPr>
+                </pic:pic>
+              </a:graphicData>
+            </a:graphic>
+          </wp:inline>
+        </w:drawing>
+      </w:r>
+    </w:p>
+    <w:p>
+      <w:pPr>
+        <w:pStyle w:val="ArticleNote"/>
+        <w:keepLines/>
+      </w:pPr>
+      <w:r>
+        <w:t>Fonte: resultados preservados do complemento 03A.05C. Os painéis usam a mesma escala de MAE; pontos representam as cinco sementes e losangos, suas médias. As linhas finas ligam A e B na mesma família e semente. A validação contém 211 horas de outubro; o teste, 1.144 horas de novembro e dezembro de 2025. As sementes repetem o treinamento nas mesmas partições, sem representar amostras temporais independentes.</w:t>
       </w:r>
     </w:p>
     <w:p>

</xml_diff>